<commit_message>
Update report and add block diagram
</commit_message>
<xml_diff>
--- a/Отчет_2_РПС.docx
+++ b/Отчет_2_РПС.docx
@@ -1350,12 +1350,11 @@
         <w:rPr>
           <w:noProof/>
         </w:rPr>
-        <w:lastRenderedPageBreak/>
         <w:drawing>
           <wp:inline distT="0" distB="0" distL="0" distR="0">
-            <wp:extent cx="3053598" cy="4887310"/>
+            <wp:extent cx="2971801" cy="4648200"/>
             <wp:effectExtent l="0" t="0" r="0" b="0"/>
-            <wp:docPr id="11" name="Рисунок 11"/>
+            <wp:docPr id="2" name="Рисунок 2"/>
             <wp:cNvGraphicFramePr>
               <a:graphicFrameLocks xmlns:a="http://schemas.openxmlformats.org/drawingml/2006/main" noChangeAspect="1"/>
             </wp:cNvGraphicFramePr>
@@ -1363,7 +1362,7 @@
               <a:graphicData uri="http://schemas.openxmlformats.org/drawingml/2006/picture">
                 <pic:pic xmlns:pic="http://schemas.openxmlformats.org/drawingml/2006/picture">
                   <pic:nvPicPr>
-                    <pic:cNvPr id="0" name="Picture 3"/>
+                    <pic:cNvPr id="0" name="Picture 1"/>
                     <pic:cNvPicPr>
                       <a:picLocks noChangeAspect="1" noChangeArrowheads="1"/>
                     </pic:cNvPicPr>
@@ -1384,7 +1383,7 @@
                   <pic:spPr bwMode="auto">
                     <a:xfrm>
                       <a:off x="0" y="0"/>
-                      <a:ext cx="3067353" cy="4909326"/>
+                      <a:ext cx="2993745" cy="4682523"/>
                     </a:xfrm>
                     <a:prstGeom prst="rect">
                       <a:avLst/>
@@ -1638,7 +1637,6 @@
           <w:bCs/>
           <w:sz w:val="24"/>
           <w:szCs w:val="24"/>
-          <w:lang w:val="en-US"/>
         </w:rPr>
       </w:pPr>
       <w:r>
@@ -1658,7 +1656,6 @@
           <w:bCs/>
           <w:sz w:val="24"/>
           <w:szCs w:val="24"/>
-          <w:lang w:val="en-US"/>
         </w:rPr>
         <w:t>:</w:t>
       </w:r>
@@ -1819,7 +1816,6 @@
           <w:sz w:val="24"/>
           <w:szCs w:val="24"/>
         </w:rPr>
-        <w:lastRenderedPageBreak/>
         <w:t xml:space="preserve">Стандартная реализация вызывает </w:t>
       </w:r>
       <w:r>
@@ -2116,15 +2112,7 @@
           <w:sz w:val="24"/>
           <w:szCs w:val="24"/>
         </w:rPr>
-        <w:t>Сумма затрат при вычислении даёт</w:t>
-      </w:r>
-      <w:r>
-        <w:rPr>
-          <w:rFonts w:ascii="Times New Roman" w:hAnsi="Times New Roman" w:cs="Times New Roman"/>
-          <w:sz w:val="24"/>
-          <w:szCs w:val="24"/>
-        </w:rPr>
-        <w:t>:</w:t>
+        <w:t>Сумма затрат при вычислении даёт:</w:t>
       </w:r>
     </w:p>
     <w:p>
@@ -3177,7 +3165,6 @@
           <w:sz w:val="24"/>
           <w:szCs w:val="24"/>
         </w:rPr>
-        <w:lastRenderedPageBreak/>
         <w:t>Лучший случай</w:t>
       </w:r>
       <w:r>
@@ -3389,10 +3376,13 @@
         <w:keepNext/>
       </w:pPr>
       <w:r>
+        <w:rPr>
+          <w:noProof/>
+        </w:rPr>
         <w:drawing>
           <wp:inline distT="0" distB="0" distL="0" distR="0" wp14:anchorId="271AAB6F" wp14:editId="4CFAA530">
-            <wp:extent cx="4888992" cy="3046278"/>
-            <wp:effectExtent l="0" t="0" r="635" b="1905"/>
+            <wp:extent cx="4784748" cy="2981325"/>
+            <wp:effectExtent l="0" t="0" r="3175" b="3175"/>
             <wp:docPr id="1" name="Рисунок 1"/>
             <wp:cNvGraphicFramePr>
               <a:graphicFrameLocks xmlns:a="http://schemas.openxmlformats.org/drawingml/2006/main" noChangeAspect="1"/>
@@ -3413,7 +3403,7 @@
                   <pic:spPr>
                     <a:xfrm>
                       <a:off x="0" y="0"/>
-                      <a:ext cx="4897572" cy="3051624"/>
+                      <a:ext cx="4823759" cy="3005632"/>
                     </a:xfrm>
                     <a:prstGeom prst="rect">
                       <a:avLst/>
@@ -3574,7 +3564,27 @@
           <w:szCs w:val="24"/>
           <w:shd w:val="clear" w:color="auto" w:fill="FFFFFF"/>
         </w:rPr>
-        <w:t>Разработать консольное приложение для сортировки целых чисел реализацией пирамидальной сортировки</w:t>
+        <w:t>Разработа</w:t>
+      </w:r>
+      <w:r>
+        <w:rPr>
+          <w:rFonts w:ascii="Times New Roman" w:hAnsi="Times New Roman" w:cs="Times New Roman"/>
+          <w:color w:val="34343C"/>
+          <w:sz w:val="24"/>
+          <w:szCs w:val="24"/>
+          <w:shd w:val="clear" w:color="auto" w:fill="FFFFFF"/>
+        </w:rPr>
+        <w:t>но</w:t>
+      </w:r>
+      <w:r>
+        <w:rPr>
+          <w:rFonts w:ascii="Times New Roman" w:hAnsi="Times New Roman" w:cs="Times New Roman"/>
+          <w:color w:val="34343C"/>
+          <w:sz w:val="24"/>
+          <w:szCs w:val="24"/>
+          <w:shd w:val="clear" w:color="auto" w:fill="FFFFFF"/>
+        </w:rPr>
+        <w:t xml:space="preserve"> консольное приложение для сортировки целых чисел реализацией пирамидальной сортировки</w:t>
       </w:r>
       <w:r>
         <w:rPr>

</xml_diff>